<commit_message>
Fix step-14 armature voltage attribution; add screenshot verification audit
Cross-checking the report against the source screenshots revealed that Figure 6
(cropped from Screenshot 2026-09-02 092337.png) has meters reading 254.7 V and
1501 r/min, but its caption, equation (9) and two further passages all claimed
255.73 V / 1501.52 r/min. Those figures are actually DT212 row 0, logged eight
minutes later at 09:31.

Equation (9) and the Figure 6 and Figure 17 captions now state what the image
actually shows. A new paragraph reconciles the two readings as a 1.0 V (0.4 %)
instance of the supply drift already documented in 7.6, and explains why the
logged 255.73 V is the value carried through the calculations.

Adds analysis/verify_against_screenshots.py, which re-derives all 35 headline
numbers from the screenshot-verified CSVs and fails loudly on any mismatch.
All 35 currently pass.

Co-authored-by: arena-agent <297053741+arena-agent@users.noreply.github.com>
</commit_message>
<xml_diff>
--- a/Lab_Report_2_Separately_Excited_DC_Motor.docx
+++ b/Lab_Report_2_Separately_Excited_DC_Motor.docx
@@ -4139,7 +4139,7 @@
           <w:b w:val="0"/>
           <w:i w:val="0"/>
         </w:rPr>
-        <w:t>The armature voltage required to produce a no-load speed of 1500 r/min was recorded in step 14 as:</w:t>
+        <w:t>In step 14 the armature voltage was trimmed until the machine ran at the required no-load speed of 1500 r/min. The live metering capture taken at that moment reads:</w:t>
       </w:r>
     </w:p>
     <w:p>
@@ -4155,7 +4155,7 @@
           <w:rFonts w:ascii="Cambria Math" w:hAnsi="Cambria Math"/>
           <w:sz w:val="23"/>
         </w:rPr>
-        <w:t>Eₐ = 255.73 V   at   n = 1500 r/min</w:t>
+        <w:t>Eₐ = 254.7 V   at   n = 1501 r/min   (step 14, 09:23)</w:t>
       </w:r>
       <w:r>
         <w:tab/>
@@ -4223,7 +4223,17 @@
         <w:fldChar w:fldCharType="end"/>
       </w:r>
       <w:r>
-        <w:t>: Metering and data table windows at step 14, showing the armature voltage of 255.73 V corresponding to a no-load speed of 1501.52 r/min (09:23 on 2 September 2026).</w:t>
+        <w:t>: Metering and data table windows at step 14, showing the armature voltage of 254.7 V corresponding to a no-load speed of 1501 r/min (09:23 on 2 September 2026).</w:t>
+      </w:r>
+    </w:p>
+    <w:p>
+      <w:r>
+        <w:rPr>
+          <w:rFonts w:ascii="Arial" w:hAnsi="Arial"/>
+          <w:b w:val="0"/>
+          <w:i w:val="0"/>
+        </w:rPr>
+        <w:t>When logging of DT212 began eight minutes later the first row was recorded as Eₐ = 255.73 V at 1501.52 r/min, 1.0 V above the step 14 meter reading. The two values describe the same operating point and differ by only 0.4 %, the discrepancy being one more instance of the supply drift discussed in Section 7.6. Because every subsequent calculation is made against the DT212 dataset, it is the logged value of 255.73 V that is carried through this report as the nominal armature voltage, so that the constants and the data they are derived from remain mutually consistent.</w:t>
       </w:r>
     </w:p>
     <w:p>
@@ -12151,7 +12161,7 @@
           <w:b w:val="0"/>
           <w:i w:val="0"/>
         </w:rPr>
-        <w:t>Using the measured armature resistance Rₐ = 28.48 Ω, the voltage-to-speed constant K₁ = 5.841 r/min/V and the armature voltage Eₐ = 255.73 V recorded in step 14, the speed was predicted at the three specified armature currents from Eᴿᴬ = IₐRₐ, Eᴄᴇᴍᶠ = Eₐ − Eᴿᴬ and n = K₁Eᴄᴇᴍᶠ.</w:t>
+        <w:t>Using the measured armature resistance Rₐ = 28.48 Ω, the voltage-to-speed constant K₁ = 5.841 r/min/V and the nominal armature voltage Eₐ = 255.73 V logged as the first row of DT212, the speed was predicted at the three specified armature currents from Eᴿᴬ = IₐRₐ, Eᴄᴇᴍᶠ = Eₐ − Eᴿᴬ and n = K₁Eᴄᴇᴍᶠ.</w:t>
       </w:r>
     </w:p>
     <w:tbl>
@@ -15220,7 +15230,7 @@
           <w:b w:val="0"/>
           <w:i w:val="0"/>
         </w:rPr>
-        <w:t>Applied to the 25 points below 1.5 A this returns Rₐ(effective) = 10.80 Ω, roughly 38 % of the 28.48 Ω obtained in step 7. The same regression provides a useful check on its own validity: its intercept of 1493.3 r/min corresponds to an armature voltage of 255.65 V, which agrees with the 255.73 V actually measured in step 14 to within 0.08 V. The fit therefore recovers the one parameter that is independently known, which gives confidence that the resistance it returns is also meaningful. Figure 12 shows the consequence directly: the measured points lie close to the curve computed with the smaller resistance and well above the curve computed with the step 7 value.</w:t>
+        <w:t>Applied to the 25 points below 1.5 A this returns Rₐ(effective) = 10.80 Ω, roughly 38 % of the 28.48 Ω obtained in step 7. The same regression provides a useful check on its own validity: its intercept of 1493.3 r/min corresponds to an armature voltage of 255.65 V, which agrees with the 255.73 V logged at the first DT212 operating point to within 0.08 V. The fit therefore recovers the one parameter that is independently known, which gives confidence that the resistance it returns is also meaningful. Figure 12 shows the consequence directly: the measured points lie close to the curve computed with the smaller resistance and well above the curve computed with the step 7 value.</w:t>
       </w:r>
     </w:p>
     <w:p>
@@ -16667,7 +16677,7 @@
         <w:fldChar w:fldCharType="end"/>
       </w:r>
       <w:r>
-        <w:t>: 09:23 — Step 14: armature voltage set to give a no-load speed of 1500 r/min. E arm. 255.73 V, speed 1501.52 r/min, recorded as the first row of DT212.</w:t>
+        <w:t>: 09:23 — Step 14: armature voltage set to give a no-load speed of 1500 r/min. E arm. 254.7 V, speed 1501 r/min. Logging of DT212 began at 09:31 with a first row of 255.73 V and 1501.52 r/min.</w:t>
       </w:r>
     </w:p>
     <w:p>

</xml_diff>